<commit_message>
NPHD: simpan jenis pengelola dan penerima manfaat per paket
Tabel nphd_pekerjaan menyimpan jenis pengelola, daftar penerima manfaat, dan
nomor NPHD terakhir. Endpoint admin: GET/PUT /api/pekerjaan/{id}/nphd-data dan
GET /api/nphd-data. Template memakai {{NAMA PENERIMA MANFAAT}} sebagai daftar
"- nama" menggantikan {{NAMAKETUA}}.

Claude-Session: https://claude.ai/code/session_013S4yuZD3HeQhe6LqcDh1HE
</commit_message>
<xml_diff>
--- a/storage/app/templates/nphd_template.docx
+++ b/storage/app/templates/nphd_template.docx
@@ -1125,7 +1125,7 @@
                 <w:rFonts w:ascii="Times New Roman" w:hAnsi="Times New Roman" w:cs="Times New Roman"/>
                 <w:b/>
               </w:rPr>
-              <w:t>2. {{NAMAKETUA}}</w:t>
+              <w:t>2. {{NAMA PENERIMA MANFAAT}}</w:t>
             </w:r>
             <w:r>
               <w:rPr>
@@ -5670,7 +5670,7 @@
                 <w:u w:val="single"/>
                 <w:lang w:val="en-US"/>
               </w:rPr>
-              <w:t>{{NAMAKETUA}}</w:t>
+              <w:t>{{NAMA PENERIMA MANFAAT}}</w:t>
             </w:r>
           </w:p>
           <w:p>
@@ -7334,7 +7334,7 @@
                 <w:b/>
                 <w:lang w:val="en-US"/>
               </w:rPr>
-              <w:t>{{NAMAKETUA}}</w:t>
+              <w:t>{{NAMA PENERIMA MANFAAT}}</w:t>
             </w:r>
           </w:p>
           <w:p>
@@ -9076,7 +9076,7 @@
                 <w:u w:val="single"/>
                 <w:lang w:val="en-US"/>
               </w:rPr>
-              <w:t>{{NAMAKETUA}}</w:t>
+              <w:t>{{NAMA PENERIMA MANFAAT}}</w:t>
             </w:r>
           </w:p>
           <w:p>

</xml_diff>

<commit_message>
NPHD template: rapikan daftar penerima di tabel BA dan blok tanda tangan
Daftar penerima di tabel Berita Acara rata kiri. Blok tanda tangan Berita Acara
dijaga tetap satu halaman, sehingga tidak terpotong saat nama penerima banyak.

Claude-Session: https://claude.ai/code/session_013S4yuZD3HeQhe6LqcDh1HE
</commit_message>
<xml_diff>
--- a/storage/app/templates/nphd_template.docx
+++ b/storage/app/templates/nphd_template.docx
@@ -7322,6 +7322,7 @@
             <w:pPr>
               <w:spacing w:after="0"/>
               <w:ind w:left="34" w:firstLine="0"/>
+              <w:jc w:val="left"/>
               <w:rPr>
                 <w:rFonts w:ascii="Times New Roman" w:hAnsi="Times New Roman" w:cs="Times New Roman"/>
                 <w:b/>
@@ -8707,6 +8708,7 @@
           </w:tcPr>
           <w:p>
             <w:pPr>
+              <w:keepNext/>
               <w:spacing w:after="0"/>
               <w:ind w:left="0" w:firstLine="0"/>
               <w:jc w:val="center"/>
@@ -8725,6 +8727,7 @@
           </w:p>
           <w:p>
             <w:pPr>
+              <w:keepNext/>
               <w:spacing w:after="0"/>
               <w:ind w:left="0" w:firstLine="0"/>
               <w:jc w:val="center"/>
@@ -8736,6 +8739,7 @@
           </w:p>
           <w:p>
             <w:pPr>
+              <w:keepNext/>
               <w:spacing w:after="0"/>
               <w:ind w:left="0" w:firstLine="0"/>
               <w:jc w:val="center"/>
@@ -8754,6 +8758,7 @@
           </w:p>
           <w:p>
             <w:pPr>
+              <w:keepNext/>
               <w:spacing w:after="0"/>
               <w:ind w:left="0" w:firstLine="0"/>
               <w:jc w:val="center"/>
@@ -8765,6 +8770,7 @@
           </w:p>
           <w:p>
             <w:pPr>
+              <w:keepNext/>
               <w:spacing w:after="0"/>
               <w:ind w:left="0" w:firstLine="0"/>
               <w:jc w:val="center"/>
@@ -8776,6 +8782,7 @@
           </w:p>
           <w:p>
             <w:pPr>
+              <w:keepNext/>
               <w:spacing w:after="0"/>
               <w:ind w:left="0" w:firstLine="0"/>
               <w:rPr>
@@ -8786,6 +8793,7 @@
           </w:p>
           <w:p>
             <w:pPr>
+              <w:keepNext/>
               <w:spacing w:after="0"/>
               <w:ind w:left="0" w:firstLine="0"/>
               <w:jc w:val="center"/>
@@ -8797,6 +8805,7 @@
           </w:p>
           <w:p>
             <w:pPr>
+              <w:keepNext/>
               <w:spacing w:after="0"/>
               <w:ind w:left="0" w:firstLine="0"/>
               <w:jc w:val="center"/>
@@ -8808,6 +8817,7 @@
           </w:p>
           <w:p>
             <w:pPr>
+              <w:keepNext/>
               <w:spacing w:after="0"/>
               <w:ind w:left="0" w:firstLine="0"/>
               <w:jc w:val="center"/>
@@ -8819,6 +8829,7 @@
           </w:p>
           <w:p>
             <w:pPr>
+              <w:keepNext/>
               <w:spacing w:after="0"/>
               <w:ind w:left="0" w:firstLine="0"/>
               <w:jc w:val="center"/>
@@ -8830,6 +8841,7 @@
           </w:p>
           <w:p>
             <w:pPr>
+              <w:keepNext/>
               <w:spacing w:after="0"/>
               <w:ind w:left="0" w:firstLine="0"/>
               <w:jc w:val="center"/>
@@ -8864,6 +8876,7 @@
           </w:p>
           <w:p>
             <w:pPr>
+              <w:keepNext/>
               <w:spacing w:after="0"/>
               <w:ind w:left="0" w:firstLine="0"/>
               <w:jc w:val="center"/>
@@ -8919,6 +8932,7 @@
           </w:p>
           <w:p>
             <w:pPr>
+              <w:keepNext/>
               <w:spacing w:after="0"/>
               <w:ind w:left="0" w:firstLine="0"/>
               <w:jc w:val="center"/>
@@ -8935,6 +8949,7 @@
           </w:tcPr>
           <w:p>
             <w:pPr>
+              <w:keepNext/>
               <w:spacing w:after="0"/>
               <w:ind w:left="0" w:firstLine="0"/>
               <w:jc w:val="center"/>
@@ -8953,6 +8968,7 @@
           </w:p>
           <w:p>
             <w:pPr>
+              <w:keepNext/>
               <w:spacing w:after="0"/>
               <w:ind w:left="0" w:firstLine="0"/>
               <w:jc w:val="center"/>
@@ -8964,6 +8980,7 @@
           </w:p>
           <w:p>
             <w:pPr>
+              <w:keepNext/>
               <w:spacing w:after="0"/>
               <w:ind w:left="0" w:firstLine="0"/>
               <w:jc w:val="center"/>
@@ -8983,6 +9000,7 @@
           </w:p>
           <w:p>
             <w:pPr>
+              <w:keepNext/>
               <w:spacing w:after="0"/>
               <w:ind w:left="0" w:firstLine="0"/>
               <w:jc w:val="center"/>
@@ -8994,6 +9012,7 @@
           </w:p>
           <w:p>
             <w:pPr>
+              <w:keepNext/>
               <w:spacing w:after="0"/>
               <w:ind w:left="0" w:firstLine="0"/>
               <w:jc w:val="center"/>
@@ -9005,6 +9024,7 @@
           </w:p>
           <w:p>
             <w:pPr>
+              <w:keepNext/>
               <w:spacing w:after="0"/>
               <w:ind w:left="0" w:firstLine="0"/>
               <w:jc w:val="center"/>
@@ -9016,6 +9036,7 @@
           </w:p>
           <w:p>
             <w:pPr>
+              <w:keepNext/>
               <w:spacing w:after="0"/>
               <w:ind w:left="0" w:firstLine="0"/>
               <w:jc w:val="center"/>
@@ -9027,6 +9048,7 @@
           </w:p>
           <w:p>
             <w:pPr>
+              <w:keepNext/>
               <w:spacing w:after="0"/>
               <w:ind w:left="0" w:firstLine="0"/>
               <w:jc w:val="center"/>
@@ -9038,6 +9060,7 @@
           </w:p>
           <w:p>
             <w:pPr>
+              <w:keepNext/>
               <w:spacing w:after="0"/>
               <w:ind w:left="0" w:firstLine="0"/>
               <w:jc w:val="center"/>
@@ -9049,6 +9072,7 @@
           </w:p>
           <w:p>
             <w:pPr>
+              <w:keepNext/>
               <w:spacing w:after="0"/>
               <w:ind w:left="0" w:firstLine="0"/>
               <w:jc w:val="center"/>
@@ -9060,6 +9084,7 @@
           </w:p>
           <w:p>
             <w:pPr>
+              <w:keepNext/>
               <w:spacing w:after="0"/>
               <w:ind w:left="0" w:firstLine="0"/>
               <w:jc w:val="center"/>

</xml_diff>

<commit_message>
NPHD: tanda tangan penerima manfaat sebagai tabel No, Nama, Tanda Tangan
Blok tanda tangan Berita Acara dibuat bertumpuk seperti contoh. Daftar penerima
manfaat tampil di tabel dengan minimal 8 baris. Tabel disisipkan saat dokumen
dibuat, dan seluruh blok dijaga tetap satu halaman.

Claude-Session: https://claude.ai/code/session_013S4yuZD3HeQhe6LqcDh1HE
</commit_message>
<xml_diff>
--- a/storage/app/templates/nphd_template.docx
+++ b/storage/app/templates/nphd_template.docx
@@ -8679,446 +8679,157 @@
         </w:rPr>
       </w:pPr>
     </w:p>
-    <w:tbl>
-      <w:tblPr>
-        <w:tblStyle w:val="TableGrid"/>
-        <w:tblW w:w="0" w:type="auto"/>
-        <w:jc w:val="center"/>
-        <w:tblBorders>
-          <w:top w:val="none" w:sz="0" w:space="0" w:color="auto"/>
-          <w:left w:val="none" w:sz="0" w:space="0" w:color="auto"/>
-          <w:bottom w:val="none" w:sz="0" w:space="0" w:color="auto"/>
-          <w:right w:val="none" w:sz="0" w:space="0" w:color="auto"/>
-          <w:insideH w:val="none" w:sz="0" w:space="0" w:color="auto"/>
-          <w:insideV w:val="none" w:sz="0" w:space="0" w:color="auto"/>
-        </w:tblBorders>
-        <w:tblLook w:val="04A0" w:firstRow="1" w:lastRow="0" w:firstColumn="1" w:lastColumn="0" w:noHBand="0" w:noVBand="1"/>
-      </w:tblPr>
-      <w:tblGrid>
-        <w:gridCol w:w="4608"/>
-        <w:gridCol w:w="4418"/>
-      </w:tblGrid>
-      <w:tr>
-        <w:trPr>
-          <w:jc w:val="center"/>
-        </w:trPr>
-        <w:tc>
-          <w:tcPr>
-            <w:tcW w:w="4928" w:type="dxa"/>
-          </w:tcPr>
-          <w:p>
-            <w:pPr>
-              <w:keepNext/>
-              <w:spacing w:after="0"/>
-              <w:ind w:left="0" w:firstLine="0"/>
-              <w:jc w:val="center"/>
-              <w:rPr>
-                <w:rFonts w:ascii="Times New Roman" w:eastAsia="Times New Roman" w:hAnsi="Times New Roman" w:cs="Times New Roman"/>
-                <w:b/>
-              </w:rPr>
-            </w:pPr>
-            <w:r>
-              <w:rPr>
-                <w:rFonts w:ascii="Times New Roman" w:eastAsia="Times New Roman" w:hAnsi="Times New Roman" w:cs="Times New Roman"/>
-                <w:b/>
-              </w:rPr>
-              <w:t>PIHAK KESATU</w:t>
-            </w:r>
-          </w:p>
-          <w:p>
-            <w:pPr>
-              <w:keepNext/>
-              <w:spacing w:after="0"/>
-              <w:ind w:left="0" w:firstLine="0"/>
-              <w:jc w:val="center"/>
-              <w:rPr>
-                <w:rFonts w:ascii="Times New Roman" w:eastAsia="Times New Roman" w:hAnsi="Times New Roman" w:cs="Times New Roman"/>
-                <w:b/>
-              </w:rPr>
-            </w:pPr>
-          </w:p>
-          <w:p>
-            <w:pPr>
-              <w:keepNext/>
-              <w:spacing w:after="0"/>
-              <w:ind w:left="0" w:firstLine="0"/>
-              <w:jc w:val="center"/>
-              <w:rPr>
-                <w:rFonts w:ascii="Times New Roman" w:eastAsia="Times New Roman" w:hAnsi="Times New Roman" w:cs="Times New Roman"/>
-                <w:b/>
-              </w:rPr>
-            </w:pPr>
-            <w:r>
-              <w:rPr>
-                <w:rFonts w:ascii="Times New Roman" w:eastAsia="Times New Roman" w:hAnsi="Times New Roman" w:cs="Times New Roman"/>
-                <w:b/>
-              </w:rPr>
-              <w:t>KEPALA DINAS</w:t>
-            </w:r>
-          </w:p>
-          <w:p>
-            <w:pPr>
-              <w:keepNext/>
-              <w:spacing w:after="0"/>
-              <w:ind w:left="0" w:firstLine="0"/>
-              <w:jc w:val="center"/>
-              <w:rPr>
-                <w:rFonts w:ascii="Times New Roman" w:eastAsia="Times New Roman" w:hAnsi="Times New Roman" w:cs="Times New Roman"/>
-                <w:b/>
-              </w:rPr>
-            </w:pPr>
-          </w:p>
-          <w:p>
-            <w:pPr>
-              <w:keepNext/>
-              <w:spacing w:after="0"/>
-              <w:ind w:left="0" w:firstLine="0"/>
-              <w:jc w:val="center"/>
-              <w:rPr>
-                <w:rFonts w:ascii="Times New Roman" w:eastAsia="Times New Roman" w:hAnsi="Times New Roman" w:cs="Times New Roman"/>
-                <w:b/>
-              </w:rPr>
-            </w:pPr>
-          </w:p>
-          <w:p>
-            <w:pPr>
-              <w:keepNext/>
-              <w:spacing w:after="0"/>
-              <w:ind w:left="0" w:firstLine="0"/>
-              <w:rPr>
-                <w:rFonts w:ascii="Times New Roman" w:eastAsia="Times New Roman" w:hAnsi="Times New Roman" w:cs="Times New Roman"/>
-                <w:b/>
-              </w:rPr>
-            </w:pPr>
-          </w:p>
-          <w:p>
-            <w:pPr>
-              <w:keepNext/>
-              <w:spacing w:after="0"/>
-              <w:ind w:left="0" w:firstLine="0"/>
-              <w:jc w:val="center"/>
-              <w:rPr>
-                <w:rFonts w:ascii="Times New Roman" w:eastAsia="Times New Roman" w:hAnsi="Times New Roman" w:cs="Times New Roman"/>
-                <w:b/>
-              </w:rPr>
-            </w:pPr>
-          </w:p>
-          <w:p>
-            <w:pPr>
-              <w:keepNext/>
-              <w:spacing w:after="0"/>
-              <w:ind w:left="0" w:firstLine="0"/>
-              <w:jc w:val="center"/>
-              <w:rPr>
-                <w:rFonts w:ascii="Times New Roman" w:eastAsia="Times New Roman" w:hAnsi="Times New Roman" w:cs="Times New Roman"/>
-                <w:b/>
-              </w:rPr>
-            </w:pPr>
-          </w:p>
-          <w:p>
-            <w:pPr>
-              <w:keepNext/>
-              <w:spacing w:after="0"/>
-              <w:ind w:left="0" w:firstLine="0"/>
-              <w:jc w:val="center"/>
-              <w:rPr>
-                <w:rFonts w:ascii="Times New Roman" w:eastAsia="Times New Roman" w:hAnsi="Times New Roman" w:cs="Times New Roman"/>
-                <w:b/>
-              </w:rPr>
-            </w:pPr>
-          </w:p>
-          <w:p>
-            <w:pPr>
-              <w:keepNext/>
-              <w:spacing w:after="0"/>
-              <w:ind w:left="0" w:firstLine="0"/>
-              <w:jc w:val="center"/>
-              <w:rPr>
-                <w:rFonts w:ascii="Times New Roman" w:eastAsia="Times New Roman" w:hAnsi="Times New Roman" w:cs="Times New Roman"/>
-                <w:b/>
-              </w:rPr>
-            </w:pPr>
-          </w:p>
-          <w:p>
-            <w:pPr>
-              <w:keepNext/>
-              <w:spacing w:after="0"/>
-              <w:ind w:left="0" w:firstLine="0"/>
-              <w:jc w:val="center"/>
-              <w:rPr>
-                <w:rFonts w:ascii="Times New Roman" w:eastAsia="Times New Roman" w:hAnsi="Times New Roman" w:cs="Times New Roman"/>
-                <w:bCs/>
-              </w:rPr>
-            </w:pPr>
-            <w:r>
-              <w:rPr>
-                <w:rFonts w:ascii="Times New Roman" w:eastAsia="Times New Roman" w:hAnsi="Times New Roman" w:cs="Times New Roman"/>
-                <w:b/>
-                <w:u w:val="single"/>
-              </w:rPr>
-              <w:t xml:space="preserve">DEDI SUPRIADI. S.IP. M.SI </w:t>
-            </w:r>
-            <w:r>
-              <w:rPr>
-                <w:rFonts w:ascii="Times New Roman" w:eastAsia="Times New Roman" w:hAnsi="Times New Roman" w:cs="Times New Roman"/>
-                <w:b/>
-                <w:u w:val="single"/>
-              </w:rPr>
-              <w:br/>
-            </w:r>
-            <w:r>
-              <w:rPr>
-                <w:rFonts w:ascii="Times New Roman" w:eastAsia="Times New Roman" w:hAnsi="Times New Roman" w:cs="Times New Roman"/>
-                <w:bCs/>
-              </w:rPr>
-              <w:t>Pembina Utama Muda / IV.c</w:t>
-            </w:r>
-          </w:p>
-          <w:p>
-            <w:pPr>
-              <w:keepNext/>
-              <w:spacing w:after="0"/>
-              <w:ind w:left="0" w:firstLine="0"/>
-              <w:jc w:val="center"/>
-              <w:rPr>
-                <w:rFonts w:ascii="Times New Roman" w:eastAsia="Times New Roman" w:hAnsi="Times New Roman" w:cs="Times New Roman"/>
-                <w:bCs/>
-              </w:rPr>
-            </w:pPr>
-            <w:r>
-              <w:rPr>
-                <w:rFonts w:ascii="Times New Roman" w:eastAsia="Times New Roman" w:hAnsi="Times New Roman" w:cs="Times New Roman"/>
-                <w:bCs/>
-              </w:rPr>
-              <w:t>NIP.</w:t>
-            </w:r>
-            <w:r>
-              <w:rPr>
-                <w:rFonts w:ascii="Times New Roman" w:eastAsia="Times New Roman" w:hAnsi="Times New Roman" w:cs="Times New Roman"/>
-                <w:bCs/>
-                <w:lang w:val="en-US"/>
-              </w:rPr>
-              <w:t xml:space="preserve"> </w:t>
-            </w:r>
-            <w:r>
-              <w:rPr>
-                <w:rFonts w:ascii="Times New Roman" w:eastAsia="Times New Roman" w:hAnsi="Times New Roman" w:cs="Times New Roman"/>
-                <w:bCs/>
-              </w:rPr>
-              <w:t>19700</w:t>
-            </w:r>
-            <w:r>
-              <w:rPr>
-                <w:rFonts w:ascii="Times New Roman" w:eastAsia="Times New Roman" w:hAnsi="Times New Roman" w:cs="Times New Roman"/>
-                <w:bCs/>
-                <w:lang w:val="en-US"/>
-              </w:rPr>
-              <w:t>2</w:t>
-            </w:r>
-            <w:r>
-              <w:rPr>
-                <w:rFonts w:ascii="Times New Roman" w:eastAsia="Times New Roman" w:hAnsi="Times New Roman" w:cs="Times New Roman"/>
-                <w:bCs/>
-              </w:rPr>
-              <w:t>18 199803</w:t>
-            </w:r>
-            <w:r>
-              <w:rPr>
-                <w:rFonts w:ascii="Times New Roman" w:eastAsia="Times New Roman" w:hAnsi="Times New Roman" w:cs="Times New Roman"/>
-                <w:bCs/>
-              </w:rPr>
-              <w:t xml:space="preserve"> 1 006</w:t>
-            </w:r>
-          </w:p>
-          <w:p>
-            <w:pPr>
-              <w:keepNext/>
-              <w:spacing w:after="0"/>
-              <w:ind w:left="0" w:firstLine="0"/>
-              <w:jc w:val="center"/>
-              <w:rPr>
-                <w:rFonts w:ascii="Times New Roman" w:eastAsia="Times New Roman" w:hAnsi="Times New Roman" w:cs="Times New Roman"/>
-                <w:b/>
-              </w:rPr>
-            </w:pPr>
-          </w:p>
-        </w:tc>
-        <w:tc>
-          <w:tcPr>
-            <w:tcW w:w="4599" w:type="dxa"/>
-          </w:tcPr>
-          <w:p>
-            <w:pPr>
-              <w:keepNext/>
-              <w:spacing w:after="0"/>
-              <w:ind w:left="0" w:firstLine="0"/>
-              <w:jc w:val="center"/>
-              <w:rPr>
-                <w:rFonts w:ascii="Times New Roman" w:eastAsia="Times New Roman" w:hAnsi="Times New Roman" w:cs="Times New Roman"/>
-                <w:b/>
-              </w:rPr>
-            </w:pPr>
-            <w:r>
-              <w:rPr>
-                <w:rFonts w:ascii="Times New Roman" w:eastAsia="Times New Roman" w:hAnsi="Times New Roman" w:cs="Times New Roman"/>
-                <w:b/>
-              </w:rPr>
-              <w:t>PIHAK KEDUA</w:t>
-            </w:r>
-          </w:p>
-          <w:p>
-            <w:pPr>
-              <w:keepNext/>
-              <w:spacing w:after="0"/>
-              <w:ind w:left="0" w:firstLine="0"/>
-              <w:jc w:val="center"/>
-              <w:rPr>
-                <w:rFonts w:ascii="Times New Roman" w:eastAsia="Times New Roman" w:hAnsi="Times New Roman" w:cs="Times New Roman"/>
-                <w:b/>
-              </w:rPr>
-            </w:pPr>
-          </w:p>
-          <w:p>
-            <w:pPr>
-              <w:keepNext/>
-              <w:spacing w:after="0"/>
-              <w:ind w:left="0" w:firstLine="0"/>
-              <w:jc w:val="center"/>
-              <w:rPr>
-                <w:rFonts w:ascii="Times New Roman" w:hAnsi="Times New Roman" w:cs="Times New Roman"/>
-                <w:b/>
-                <w:lang w:val="en-US"/>
-              </w:rPr>
-            </w:pPr>
-            <w:r>
-              <w:rPr>
-                <w:rFonts w:ascii="Times New Roman" w:hAnsi="Times New Roman" w:cs="Times New Roman"/>
-                <w:b/>
-              </w:rPr>
-              <w:t>{{NAMAPENGELOLA}}</w:t>
-            </w:r>
-          </w:p>
-          <w:p>
-            <w:pPr>
-              <w:keepNext/>
-              <w:spacing w:after="0"/>
-              <w:ind w:left="0" w:firstLine="0"/>
-              <w:jc w:val="center"/>
-              <w:rPr>
-                <w:rFonts w:ascii="Times New Roman" w:eastAsia="Times New Roman" w:hAnsi="Times New Roman" w:cs="Times New Roman"/>
-                <w:b/>
-              </w:rPr>
-            </w:pPr>
-          </w:p>
-          <w:p>
-            <w:pPr>
-              <w:keepNext/>
-              <w:spacing w:after="0"/>
-              <w:ind w:left="0" w:firstLine="0"/>
-              <w:jc w:val="center"/>
-              <w:rPr>
-                <w:rFonts w:ascii="Times New Roman" w:eastAsia="Times New Roman" w:hAnsi="Times New Roman" w:cs="Times New Roman"/>
-                <w:b/>
-              </w:rPr>
-            </w:pPr>
-          </w:p>
-          <w:p>
-            <w:pPr>
-              <w:keepNext/>
-              <w:spacing w:after="0"/>
-              <w:ind w:left="0" w:firstLine="0"/>
-              <w:jc w:val="center"/>
-              <w:rPr>
-                <w:rFonts w:ascii="Times New Roman" w:eastAsia="Times New Roman" w:hAnsi="Times New Roman" w:cs="Times New Roman"/>
-                <w:b/>
-              </w:rPr>
-            </w:pPr>
-          </w:p>
-          <w:p>
-            <w:pPr>
-              <w:keepNext/>
-              <w:spacing w:after="0"/>
-              <w:ind w:left="0" w:firstLine="0"/>
-              <w:jc w:val="center"/>
-              <w:rPr>
-                <w:rFonts w:ascii="Times New Roman" w:eastAsia="Times New Roman" w:hAnsi="Times New Roman" w:cs="Times New Roman"/>
-                <w:b/>
-              </w:rPr>
-            </w:pPr>
-          </w:p>
-          <w:p>
-            <w:pPr>
-              <w:keepNext/>
-              <w:spacing w:after="0"/>
-              <w:ind w:left="0" w:firstLine="0"/>
-              <w:jc w:val="center"/>
-              <w:rPr>
-                <w:rFonts w:ascii="Times New Roman" w:eastAsia="Times New Roman" w:hAnsi="Times New Roman" w:cs="Times New Roman"/>
-                <w:b/>
-              </w:rPr>
-            </w:pPr>
-          </w:p>
-          <w:p>
-            <w:pPr>
-              <w:keepNext/>
-              <w:spacing w:after="0"/>
-              <w:ind w:left="0" w:firstLine="0"/>
-              <w:jc w:val="center"/>
-              <w:rPr>
-                <w:rFonts w:ascii="Times New Roman" w:eastAsia="Times New Roman" w:hAnsi="Times New Roman" w:cs="Times New Roman"/>
-                <w:b/>
-              </w:rPr>
-            </w:pPr>
-          </w:p>
-          <w:p>
-            <w:pPr>
-              <w:keepNext/>
-              <w:spacing w:after="0"/>
-              <w:ind w:left="0" w:firstLine="0"/>
-              <w:jc w:val="center"/>
-              <w:rPr>
-                <w:rFonts w:ascii="Times New Roman" w:eastAsia="Times New Roman" w:hAnsi="Times New Roman" w:cs="Times New Roman"/>
-                <w:b/>
-              </w:rPr>
-            </w:pPr>
-          </w:p>
-          <w:p>
-            <w:pPr>
-              <w:keepNext/>
-              <w:spacing w:after="0"/>
-              <w:ind w:left="0" w:firstLine="0"/>
-              <w:jc w:val="center"/>
-              <w:rPr>
-                <w:rFonts w:ascii="Times New Roman" w:eastAsia="Times New Roman" w:hAnsi="Times New Roman" w:cs="Times New Roman"/>
-                <w:b/>
-                <w:u w:val="single"/>
-                <w:lang w:val="en-US"/>
-              </w:rPr>
-            </w:pPr>
-            <w:r>
-              <w:rPr>
-                <w:rFonts w:ascii="Times New Roman" w:eastAsia="Times New Roman" w:hAnsi="Times New Roman" w:cs="Times New Roman"/>
-                <w:b/>
-                <w:u w:val="single"/>
-                <w:lang w:val="en-US"/>
-              </w:rPr>
-              <w:t>{{NAMA PENERIMA MANFAAT}}</w:t>
-            </w:r>
-          </w:p>
-          <w:p>
-            <w:pPr>
-              <w:spacing w:after="0"/>
-              <w:ind w:left="0" w:firstLine="0"/>
-              <w:jc w:val="center"/>
-              <w:rPr>
-                <w:rFonts w:ascii="Times New Roman" w:eastAsia="Times New Roman" w:hAnsi="Times New Roman" w:cs="Times New Roman"/>
-                <w:b/>
-              </w:rPr>
-            </w:pPr>
-          </w:p>
-        </w:tc>
-      </w:tr>
-    </w:tbl>
+    <w:p>
+      <w:pPr>
+        <w:keepNext/>
+        <w:spacing w:after="0"/>
+        <w:ind w:left="0" w:firstLine="0"/>
+        <w:jc w:val="left"/>
+      </w:pPr>
+      <w:r>
+        <w:rPr>
+          <w:rFonts w:ascii="Times New Roman" w:hAnsi="Times New Roman" w:cs="Times New Roman"/>
+          <w:b/>
+          <w:sz w:val="24"/>
+        </w:rPr>
+        <w:t xml:space="preserve">PIHAK KESATU</w:t>
+      </w:r>
+    </w:p>
+    <w:p>
+      <w:pPr>
+        <w:keepNext/>
+        <w:spacing w:after="0"/>
+        <w:ind w:left="0" w:firstLine="0"/>
+        <w:jc w:val="left"/>
+      </w:pPr>
+      <w:r>
+        <w:rPr>
+          <w:rFonts w:ascii="Times New Roman" w:hAnsi="Times New Roman" w:cs="Times New Roman"/>
+          <w:b/>
+          <w:sz w:val="24"/>
+        </w:rPr>
+        <w:t xml:space="preserve">KEPALA DINAS</w:t>
+      </w:r>
+    </w:p>
+    <w:p>
+      <w:pPr>
+        <w:keepNext/>
+        <w:spacing w:after="0"/>
+        <w:ind w:left="0" w:firstLine="0"/>
+        <w:jc w:val="left"/>
+      </w:pPr>
+    </w:p>
+    <w:p>
+      <w:pPr>
+        <w:keepNext/>
+        <w:spacing w:after="0"/>
+        <w:ind w:left="0" w:firstLine="0"/>
+        <w:jc w:val="left"/>
+      </w:pPr>
+    </w:p>
+    <w:p>
+      <w:pPr>
+        <w:keepNext/>
+        <w:spacing w:after="0"/>
+        <w:ind w:left="0" w:firstLine="0"/>
+        <w:jc w:val="left"/>
+      </w:pPr>
+    </w:p>
+    <w:p>
+      <w:pPr>
+        <w:keepNext/>
+        <w:spacing w:after="0"/>
+        <w:ind w:left="0" w:firstLine="0"/>
+        <w:jc w:val="left"/>
+      </w:pPr>
+      <w:r>
+        <w:rPr>
+          <w:rFonts w:ascii="Times New Roman" w:hAnsi="Times New Roman" w:cs="Times New Roman"/>
+          <w:b/>
+          <w:u w:val="single"/>
+          <w:sz w:val="24"/>
+        </w:rPr>
+        <w:t xml:space="preserve">DEDI SUPRIADI. S.IP. M.SI</w:t>
+      </w:r>
+    </w:p>
+    <w:p>
+      <w:pPr>
+        <w:keepNext/>
+        <w:spacing w:after="0"/>
+        <w:ind w:left="0" w:firstLine="0"/>
+        <w:jc w:val="left"/>
+      </w:pPr>
+      <w:r>
+        <w:rPr>
+          <w:rFonts w:ascii="Times New Roman" w:hAnsi="Times New Roman" w:cs="Times New Roman"/>
+          <w:b/>
+          <w:sz w:val="24"/>
+        </w:rPr>
+        <w:t xml:space="preserve">NIP. 19700218 199803 1 006</w:t>
+      </w:r>
+    </w:p>
+    <w:p>
+      <w:pPr>
+        <w:keepNext/>
+        <w:spacing w:after="0"/>
+        <w:ind w:left="0" w:firstLine="0"/>
+        <w:jc w:val="left"/>
+      </w:pPr>
+    </w:p>
+    <w:p>
+      <w:pPr>
+        <w:keepNext/>
+        <w:spacing w:after="0"/>
+        <w:ind w:left="0" w:firstLine="0"/>
+        <w:jc w:val="left"/>
+      </w:pPr>
+      <w:r>
+        <w:rPr>
+          <w:rFonts w:ascii="Times New Roman" w:hAnsi="Times New Roman" w:cs="Times New Roman"/>
+          <w:b/>
+          <w:sz w:val="24"/>
+        </w:rPr>
+        <w:t xml:space="preserve">PIHAK KEDUA</w:t>
+      </w:r>
+    </w:p>
+    <w:p>
+      <w:pPr>
+        <w:keepNext/>
+        <w:spacing w:after="0"/>
+        <w:ind w:left="0" w:firstLine="0"/>
+        <w:jc w:val="left"/>
+      </w:pPr>
+      <w:r>
+        <w:rPr>
+          <w:rFonts w:ascii="Times New Roman" w:hAnsi="Times New Roman" w:cs="Times New Roman"/>
+          <w:b/>
+          <w:sz w:val="24"/>
+        </w:rPr>
+        <w:t xml:space="preserve">{{NAMAPENGELOLA}}</w:t>
+      </w:r>
+    </w:p>
+    <w:p>
+      <w:pPr>
+        <w:keepNext/>
+        <w:spacing w:after="0"/>
+        <w:ind w:left="0" w:firstLine="0"/>
+        <w:jc w:val="left"/>
+      </w:pPr>
+      <w:r>
+        <w:rPr>
+          <w:rFonts w:ascii="Times New Roman" w:hAnsi="Times New Roman" w:cs="Times New Roman"/>
+          <w:sz w:val="24"/>
+        </w:rPr>
+        <w:t xml:space="preserve">{{TABEL PENERIMA}}</w:t>
+      </w:r>
+    </w:p>
+    <w:p>
+      <w:pPr>
+        <w:spacing w:after="0"/>
+        <w:ind w:left="0" w:firstLine="0"/>
+        <w:jc w:val="left"/>
+      </w:pPr>
+    </w:p>
     <w:p>
       <w:pPr>
         <w:spacing w:after="0" w:line="360" w:lineRule="auto"/>

</xml_diff>